<commit_message>
Padroniza margens ABNT no modelo Word de Pesquisa/Extensão de Jogos
As seções de resumo/sumário e de texto tinham margens fora do padrão
(texto com esquerda 2 cm e direita 3 cm). Todas as seções passam a usar
superior/esquerda 3 cm e inferior/direita 2 cm.

Co-Authored-By: Claude Opus 5.5 <noreply@anthropic.com>
</commit_message>
<xml_diff>
--- a/files/jogo/pesquisa-extensao-metalinguistico.docx
+++ b/files/jogo/pesquisa-extensao-metalinguistico.docx
@@ -2214,7 +2214,7 @@
         <w:sectPr>
           <w:headerReference w:type="default" r:id="rId9"/>
           <w:pgSz w:w="11906" w:h="16838"/>
-          <w:pgMar w:top="1409" w:right="850" w:bottom="850" w:left="1134" w:header="850" w:footer="0" w:gutter="0"/>
+          <w:pgMar w:top="1701" w:right="1134" w:bottom="1134" w:left="1701" w:header="850" w:footer="0" w:gutter="0"/>
           <w:cols w:space="720"/>
         </w:sectPr>
       </w:pPr>
@@ -3939,7 +3939,7 @@
     <w:sectPr>
       <w:headerReference w:type="default" r:id="rId12"/>
       <w:pgSz w:w="11906" w:h="16838"/>
-      <w:pgMar w:top="1134" w:right="1701" w:bottom="1701" w:left="1134" w:header="1134" w:footer="0" w:gutter="0"/>
+      <w:pgMar w:top="1701" w:right="1134" w:bottom="1134" w:left="1701" w:header="1134" w:footer="0" w:gutter="0"/>
       <w:pgNumType w:start="5"/>
       <w:cols w:space="720"/>
     </w:sectPr>

</xml_diff>

<commit_message>
Reverte alteração de margens no modelo Word de Jogos
Os arquivos de files/jogo/ pertencem à coordenação do curso de Jogos
Digitais e não devem ser alterados por aqui.

This reverts commit 0d5888a.

Co-Authored-By: Claude Opus 5.5 <noreply@anthropic.com>
</commit_message>
<xml_diff>
--- a/files/jogo/pesquisa-extensao-metalinguistico.docx
+++ b/files/jogo/pesquisa-extensao-metalinguistico.docx
@@ -2214,7 +2214,7 @@
         <w:sectPr>
           <w:headerReference w:type="default" r:id="rId9"/>
           <w:pgSz w:w="11906" w:h="16838"/>
-          <w:pgMar w:top="1701" w:right="1134" w:bottom="1134" w:left="1701" w:header="850" w:footer="0" w:gutter="0"/>
+          <w:pgMar w:top="1409" w:right="850" w:bottom="850" w:left="1134" w:header="850" w:footer="0" w:gutter="0"/>
           <w:cols w:space="720"/>
         </w:sectPr>
       </w:pPr>
@@ -3939,7 +3939,7 @@
     <w:sectPr>
       <w:headerReference w:type="default" r:id="rId12"/>
       <w:pgSz w:w="11906" w:h="16838"/>
-      <w:pgMar w:top="1701" w:right="1134" w:bottom="1134" w:left="1701" w:header="1134" w:footer="0" w:gutter="0"/>
+      <w:pgMar w:top="1134" w:right="1701" w:bottom="1701" w:left="1134" w:header="1134" w:footer="0" w:gutter="0"/>
       <w:pgNumType w:start="5"/>
       <w:cols w:space="720"/>
     </w:sectPr>

</xml_diff>